<commit_message>
Finalize deployment handoff and UI clarity
</commit_message>
<xml_diff>
--- a/docs/Lead-Response-Desk-Technical-Handoff.docx
+++ b/docs/Lead-Response-Desk-Technical-Handoff.docx
@@ -49,62 +49,27 @@
         <w:t>Roopkala Lead Desk - Version 1</w:t>
       </w:r>
     </w:p>
-    <w:tbl>
-      <w:tblPr>
-        <w:tblW w:type="auto" w:w="0"/>
-        <w:jc w:val="center"/>
-        <w:tblLayout w:type="fixed"/>
-        <w:tblLook w:firstColumn="1" w:firstRow="1" w:lastColumn="0" w:lastRow="0" w:noHBand="0" w:noVBand="1" w:val="04A0"/>
-      </w:tblPr>
-      <w:tblGrid>
-        <w:gridCol w:w="9720"/>
-      </w:tblGrid>
-      <w:tr>
-        <w:tc>
-          <w:tcPr>
-            <w:tcW w:type="dxa" w:w="9994"/>
-            <w:shd w:fill="EAF5EE"/>
-            <w:tcMar>
-              <w:top w:w="140" w:type="dxa"/>
-              <w:start w:w="160" w:type="dxa"/>
-              <w:bottom w:w="140" w:type="dxa"/>
-              <w:end w:w="160" w:type="dxa"/>
-            </w:tcMar>
-          </w:tcPr>
-          <w:p>
-            <w:pPr>
-              <w:spacing w:after="40"/>
-            </w:pPr>
-            <w:r>
-              <w:rPr>
-                <w:rFonts w:ascii="Arial" w:hAnsi="Arial"/>
-                <w:b/>
-                <w:color w:val="000000"/>
-                <w:sz w:val="21"/>
-              </w:rPr>
-              <w:t>HANDOFF STATUS: IMPLEMENTATION COMPLETE; EXTERNAL ACTIVATION REMAINS</w:t>
-            </w:r>
-          </w:p>
-          <w:p>
-            <w:pPr>
-              <w:spacing w:after="0" w:line="259" w:lineRule="auto"/>
-            </w:pPr>
-            <w:r>
-              <w:rPr>
-                <w:rFonts w:ascii="Arial" w:hAnsi="Arial"/>
-                <w:color w:val="000000"/>
-                <w:sz w:val="18"/>
-              </w:rPr>
-              <w:t>The application, database migrations, worker jobs, tenancy controls and production configuration are complete and verified locally. Live VPS deployment, real Google credentials, the real Meta account, approved DNS and physical-device acceptance remain deployment activities.</w:t>
-            </w:r>
-          </w:p>
-        </w:tc>
-      </w:tr>
-    </w:tbl>
     <w:p>
       <w:pPr>
-        <w:spacing w:after="0"/>
+        <w:spacing w:before="120" w:after="80"/>
       </w:pPr>
+      <w:r>
+        <w:rPr>
+          <w:rFonts w:ascii="Arial" w:hAnsi="Arial"/>
+          <w:b/>
+          <w:color w:val="000000"/>
+          <w:sz w:val="19"/>
+        </w:rPr>
+        <w:t xml:space="preserve">HANDOFF STATUS: IMPLEMENTATION COMPLETE; EXTERNAL ACTIVATION REMAINS. </w:t>
+      </w:r>
+      <w:r>
+        <w:rPr>
+          <w:rFonts w:ascii="Arial" w:hAnsi="Arial"/>
+          <w:color w:val="000000"/>
+          <w:sz w:val="19"/>
+        </w:rPr>
+        <w:t>The application, database migrations, worker jobs, tenancy controls and production configuration are complete and verified locally. Call and WhatsApp links were tested on real phones and recorded attempts. Live VPS deployment, real Google credentials, the real Meta account, approved DNS and final production-device acceptance remain deployment activities.</w:t>
+      </w:r>
     </w:p>
     <w:p>
       <w:pPr>
@@ -174,7 +139,7 @@
           <w:color w:val="000000"/>
           <w:sz w:val="19"/>
         </w:rPr>
-        <w:t>23 September 2026</w:t>
+        <w:t>24 September 2026</w:t>
       </w:r>
     </w:p>
     <w:p>
@@ -196,7 +161,7 @@
           <w:color w:val="000000"/>
           <w:sz w:val="19"/>
         </w:rPr>
-        <w:t>43 automated tests; clean database bootstrap; production build</w:t>
+        <w:t>45 automated tests; clean database bootstrap; production build</w:t>
       </w:r>
     </w:p>
     <w:p>
@@ -753,7 +718,7 @@
                 <w:color w:val="000000"/>
                 <w:sz w:val="16"/>
               </w:rPr>
-              <w:t>Local Docker run</w:t>
+              <w:t>Existing VPS</w:t>
             </w:r>
           </w:p>
         </w:tc>
@@ -779,6 +744,84 @@
                 <w:color w:val="000000"/>
                 <w:sz w:val="16"/>
               </w:rPr>
+              <w:t>READY</w:t>
+            </w:r>
+          </w:p>
+        </w:tc>
+        <w:tc>
+          <w:tcPr>
+            <w:tcW w:type="dxa" w:w="6408"/>
+            <w:tcMar>
+              <w:top w:w="90" w:type="dxa"/>
+              <w:start w:w="110" w:type="dxa"/>
+              <w:bottom w:w="90" w:type="dxa"/>
+              <w:end w:w="110" w:type="dxa"/>
+            </w:tcMar>
+            <w:vAlign w:val="top"/>
+            <w:shd w:fill="F7F9FB"/>
+          </w:tcPr>
+          <w:p>
+            <w:pPr>
+              <w:spacing w:after="0" w:line="245" w:lineRule="auto"/>
+            </w:pPr>
+            <w:r>
+              <w:rPr>
+                <w:rFonts w:ascii="Arial" w:hAnsi="Arial"/>
+                <w:color w:val="000000"/>
+                <w:sz w:val="16"/>
+              </w:rPr>
+              <w:t>Compose override omits bundled Caddy and binds web to 127.0.0.1:3010 for the existing reverse proxy.</w:t>
+            </w:r>
+          </w:p>
+        </w:tc>
+      </w:tr>
+      <w:tr>
+        <w:tc>
+          <w:tcPr>
+            <w:tcW w:type="dxa" w:w="1800"/>
+            <w:tcMar>
+              <w:top w:w="90" w:type="dxa"/>
+              <w:start w:w="110" w:type="dxa"/>
+              <w:bottom w:w="90" w:type="dxa"/>
+              <w:end w:w="110" w:type="dxa"/>
+            </w:tcMar>
+            <w:vAlign w:val="top"/>
+          </w:tcPr>
+          <w:p>
+            <w:pPr>
+              <w:spacing w:after="0" w:line="245" w:lineRule="auto"/>
+            </w:pPr>
+            <w:r>
+              <w:rPr>
+                <w:rFonts w:ascii="Arial" w:hAnsi="Arial"/>
+                <w:color w:val="000000"/>
+                <w:sz w:val="16"/>
+              </w:rPr>
+              <w:t>Local Docker run</w:t>
+            </w:r>
+          </w:p>
+        </w:tc>
+        <w:tc>
+          <w:tcPr>
+            <w:tcW w:type="dxa" w:w="1512"/>
+            <w:tcMar>
+              <w:top w:w="90" w:type="dxa"/>
+              <w:start w:w="110" w:type="dxa"/>
+              <w:bottom w:w="90" w:type="dxa"/>
+              <w:end w:w="110" w:type="dxa"/>
+            </w:tcMar>
+            <w:vAlign w:val="top"/>
+          </w:tcPr>
+          <w:p>
+            <w:pPr>
+              <w:spacing w:after="0" w:line="245" w:lineRule="auto"/>
+            </w:pPr>
+            <w:r>
+              <w:rPr>
+                <w:rFonts w:ascii="Arial" w:hAnsi="Arial"/>
+                <w:color w:val="000000"/>
+                <w:sz w:val="16"/>
+              </w:rPr>
               <w:t>BLOCKED</w:t>
             </w:r>
           </w:p>
@@ -793,7 +836,6 @@
               <w:end w:w="110" w:type="dxa"/>
             </w:tcMar>
             <w:vAlign w:val="top"/>
-            <w:shd w:fill="F7F9FB"/>
           </w:tcPr>
           <w:p>
             <w:pPr>
@@ -965,7 +1007,7 @@
           <w:color w:val="000000"/>
           <w:sz w:val="18"/>
         </w:rPr>
-        <w:t>Physical iOS/Android acceptance was not executed; mobile behavior is covered by code/contract tests.</w:t>
+        <w:t>Call and WhatsApp were verified on real phones. Final navigation, quick-note, follow-up and outcome acceptance remains for the exact production phone/browser combination.</w:t>
       </w:r>
     </w:p>
     <w:p>
@@ -2313,6 +2355,21 @@
           <w:color w:val="000000"/>
           <w:sz w:val="18"/>
         </w:rPr>
+        <w:t>The client currently has one salesperson, so the existing assignment logic sends every new lead to that user without a CRM change.</w:t>
+      </w:r>
+    </w:p>
+    <w:p>
+      <w:pPr>
+        <w:pStyle w:val="ListBullet"/>
+        <w:spacing w:after="46" w:line="252" w:lineRule="auto"/>
+        <w:ind w:left="317" w:hanging="230"/>
+      </w:pPr>
+      <w:r>
+        <w:rPr>
+          <w:rFonts w:ascii="Arial" w:hAnsi="Arial"/>
+          <w:color w:val="000000"/>
+          <w:sz w:val="18"/>
+        </w:rPr>
         <w:t>Round-robin alternates across active salespeople, skips disabled users and falls back to the owner when nobody is active.</w:t>
       </w:r>
     </w:p>
@@ -2374,7 +2431,7 @@
           <w:color w:val="000000"/>
           <w:sz w:val="18"/>
         </w:rPr>
-        <w:t>The queue has Untouched, Follow-ups due and Active sections, with 30-second refresh, alert counters, sound and a tap-to-enable control.</w:t>
+        <w:t>The queue has Untouched, Follow-ups due, Missed follow-ups and Active sections, with 30-second refresh, alert counters, sound and a tap-to-enable control. Missed work stays visible and actionable below the due section.</w:t>
       </w:r>
     </w:p>
     <w:p>
@@ -3195,62 +3252,27 @@
         <w:t>Enable META_CONNECTION_ENABLED and restart web and worker after the test lead appears exactly once.</w:t>
       </w:r>
     </w:p>
-    <w:tbl>
-      <w:tblPr>
-        <w:tblW w:type="auto" w:w="0"/>
-        <w:jc w:val="center"/>
-        <w:tblLayout w:type="fixed"/>
-        <w:tblLook w:firstColumn="1" w:firstRow="1" w:lastColumn="0" w:lastRow="0" w:noHBand="0" w:noVBand="1" w:val="04A0"/>
-      </w:tblPr>
-      <w:tblGrid>
-        <w:gridCol w:w="9720"/>
-      </w:tblGrid>
-      <w:tr>
-        <w:tc>
-          <w:tcPr>
-            <w:tcW w:type="dxa" w:w="9994"/>
-            <w:shd w:fill="FFF4D6"/>
-            <w:tcMar>
-              <w:top w:w="140" w:type="dxa"/>
-              <w:start w:w="160" w:type="dxa"/>
-              <w:bottom w:w="140" w:type="dxa"/>
-              <w:end w:w="160" w:type="dxa"/>
-            </w:tcMar>
-          </w:tcPr>
-          <w:p>
-            <w:pPr>
-              <w:spacing w:after="40"/>
-            </w:pPr>
-            <w:r>
-              <w:rPr>
-                <w:rFonts w:ascii="Arial" w:hAnsi="Arial"/>
-                <w:b/>
-                <w:color w:val="000000"/>
-                <w:sz w:val="21"/>
-              </w:rPr>
-              <w:t>SECURITY NOTE</w:t>
-            </w:r>
-          </w:p>
-          <w:p>
-            <w:pPr>
-              <w:spacing w:after="0" w:line="259" w:lineRule="auto"/>
-            </w:pPr>
-            <w:r>
-              <w:rPr>
-                <w:rFonts w:ascii="Arial" w:hAnsi="Arial"/>
-                <w:color w:val="000000"/>
-                <w:sz w:val="18"/>
-              </w:rPr>
-              <w:t>Do not paste live tokens into tickets, commits, screenshots or this handoff. Rotate any credential that has been exposed.</w:t>
-            </w:r>
-          </w:p>
-        </w:tc>
-      </w:tr>
-    </w:tbl>
     <w:p>
       <w:pPr>
-        <w:spacing w:after="0"/>
+        <w:spacing w:before="120" w:after="80"/>
       </w:pPr>
+      <w:r>
+        <w:rPr>
+          <w:rFonts w:ascii="Arial" w:hAnsi="Arial"/>
+          <w:b/>
+          <w:color w:val="000000"/>
+          <w:sz w:val="19"/>
+        </w:rPr>
+        <w:t xml:space="preserve">SECURITY NOTE. </w:t>
+      </w:r>
+      <w:r>
+        <w:rPr>
+          <w:rFonts w:ascii="Arial" w:hAnsi="Arial"/>
+          <w:color w:val="000000"/>
+          <w:sz w:val="19"/>
+        </w:rPr>
+        <w:t>Do not paste live tokens into tickets, commits, screenshots or this handoff. Rotate any credential that has been exposed.</w:t>
+      </w:r>
     </w:p>
     <w:p>
       <w:r>
@@ -3451,7 +3473,7 @@
                 <w:color w:val="000000"/>
                 <w:sz w:val="16"/>
               </w:rPr>
-              <w:t>7 test files; 43 tests passed</w:t>
+              <w:t>7 test files; 45 tests passed</w:t>
             </w:r>
           </w:p>
         </w:tc>
@@ -4409,7 +4431,7 @@
           <w:color w:val="000000"/>
           <w:sz w:val="18"/>
         </w:rPr>
-        <w:t>Steps 1-4 and 6-15 passed through automated real-database coverage and/or direct production-process checks. Step 5 (physical iOS/Android tap behavior) is partial: link and background-send contracts pass, but a human device run remains required. The live Meta portion of step 11 remains external; signed mocked Meta and concurrent real-database dedupe passed.</w:t>
+        <w:t>Steps 1-4 and 6-15 passed through automated real-database coverage and/or direct production-process checks. Call and WhatsApp link opening and attempt recording were additionally verified on real phones. Final end-to-end navigation, quick-note, follow-up and outcome acceptance remains for the exact production phone/browser combination. The live Meta portion of step 11 remains external; signed mocked Meta and concurrent real-database dedupe passed.</w:t>
       </w:r>
     </w:p>
     <w:p>
@@ -4570,6 +4592,128 @@
           <w:color w:val="000000"/>
           <w:sz w:val="23"/>
         </w:rPr>
+        <w:t>Existing VPS and reverse proxy</w:t>
+      </w:r>
+    </w:p>
+    <w:p>
+      <w:pPr>
+        <w:spacing w:after="80" w:line="259" w:lineRule="auto"/>
+      </w:pPr>
+      <w:r>
+        <w:rPr>
+          <w:rFonts w:ascii="Arial" w:hAnsi="Arial"/>
+          <w:color w:val="000000"/>
+          <w:sz w:val="18"/>
+        </w:rPr>
+        <w:t>When the VPS already hosts the client's CRM, use compose.yaml with compose.existing-proxy.yaml. It starts a separate PostgreSQL database, migration service, web service and worker without the bundled Caddy, and binds web only to 127.0.0.1 on port 3010 by default. Check free ports first and add one site block to the existing nginx, Caddy or Traefik configuration. Do not stop or reuse the CRM's containers, proxy site, network, volumes or database.</w:t>
+      </w:r>
+    </w:p>
+    <w:tbl>
+      <w:tblPr>
+        <w:tblW w:type="auto" w:w="0"/>
+        <w:jc w:val="center"/>
+        <w:tblLook w:firstColumn="1" w:firstRow="1" w:lastColumn="0" w:lastRow="0" w:noHBand="0" w:noVBand="1" w:val="04A0"/>
+      </w:tblPr>
+      <w:tblGrid>
+        <w:gridCol w:w="9994"/>
+      </w:tblGrid>
+      <w:tr>
+        <w:tc>
+          <w:tcPr>
+            <w:tcW w:type="dxa" w:w="9994"/>
+            <w:shd w:fill="F2F4F7"/>
+            <w:tcMar>
+              <w:top w:w="120" w:type="dxa"/>
+              <w:start w:w="140" w:type="dxa"/>
+              <w:bottom w:w="120" w:type="dxa"/>
+              <w:end w:w="140" w:type="dxa"/>
+            </w:tcMar>
+          </w:tcPr>
+          <w:p>
+            <w:pPr>
+              <w:spacing w:after="0" w:line="240" w:lineRule="auto"/>
+            </w:pPr>
+            <w:r>
+              <w:rPr>
+                <w:rFonts w:ascii="Courier New" w:hAnsi="Courier New"/>
+                <w:color w:val="000000"/>
+                <w:sz w:val="15"/>
+              </w:rPr>
+              <w:t>export LRD_WEB_PORT=3010</w:t>
+            </w:r>
+            <w:r>
+              <w:br/>
+            </w:r>
+            <w:r>
+              <w:rPr>
+                <w:rFonts w:ascii="Courier New" w:hAnsi="Courier New"/>
+                <w:color w:val="000000"/>
+                <w:sz w:val="15"/>
+              </w:rPr>
+              <w:t>docker compose -f compose.yaml -f compose.existing-proxy.yaml up -d --build postgres migrate web worker</w:t>
+            </w:r>
+            <w:r>
+              <w:br/>
+            </w:r>
+            <w:r>
+              <w:rPr>
+                <w:rFonts w:ascii="Courier New" w:hAnsi="Courier New"/>
+                <w:color w:val="000000"/>
+                <w:sz w:val="15"/>
+              </w:rPr>
+              <w:t>curl -fsS http://127.0.0.1:${LRD_WEB_PORT}/api/health</w:t>
+            </w:r>
+          </w:p>
+        </w:tc>
+      </w:tr>
+    </w:tbl>
+    <w:p>
+      <w:pPr>
+        <w:spacing w:after="0"/>
+      </w:pPr>
+    </w:p>
+    <w:p>
+      <w:pPr>
+        <w:pStyle w:val="Heading2"/>
+        <w:keepNext/>
+        <w:spacing w:before="100" w:after="80"/>
+      </w:pPr>
+      <w:r>
+        <w:rPr>
+          <w:rFonts w:ascii="Arial" w:hAnsi="Arial"/>
+          <w:b/>
+          <w:color w:val="000000"/>
+          <w:sz w:val="23"/>
+        </w:rPr>
+        <w:t>CRM connection points</w:t>
+      </w:r>
+    </w:p>
+    <w:p>
+      <w:pPr>
+        <w:spacing w:after="80" w:line="259" w:lineRule="auto"/>
+      </w:pPr>
+      <w:r>
+        <w:rPr>
+          <w:rFonts w:ascii="Arial" w:hAnsi="Arial"/>
+          <w:color w:val="000000"/>
+          <w:sz w:val="18"/>
+        </w:rPr>
+        <w:t>For future CRM-supplied assignment, extend InboundLead and resolve an external salesperson identifier inside ingestLead before falling back to nextAssignee. For outbound lead_received, first_touch, followup_answered, followup_missed and outcome events, add a tenant-scoped transactional outbox and let the worker deliver signed, idempotent webhooks with retry/backoff. The CRM can read /api/today, /api/dashboard, or a future service route backed by src/services/product-read-models.ts. Do not share databases or credentials.</w:t>
+      </w:r>
+    </w:p>
+    <w:p>
+      <w:pPr>
+        <w:pStyle w:val="Heading2"/>
+        <w:keepNext/>
+        <w:spacing w:before="100" w:after="80"/>
+      </w:pPr>
+      <w:r>
+        <w:rPr>
+          <w:rFonts w:ascii="Arial" w:hAnsi="Arial"/>
+          <w:b/>
+          <w:color w:val="000000"/>
+          <w:sz w:val="23"/>
+        </w:rPr>
         <w:t>Post-launch acceptance</w:t>
       </w:r>
     </w:p>
@@ -4612,7 +4756,7 @@
           <w:color w:val="000000"/>
           <w:sz w:val="18"/>
         </w:rPr>
-        <w:t>3.  On a real phone, test navigation, Call, WhatsApp, quick note, follow-up Yes/No and outcome gates.</w:t>
+        <w:t>3.  On the production phone/browser combination, test navigation, quick note, follow-up Yes/No and outcome gates; Call and WhatsApp link/attempt behavior is already device-verified.</w:t>
       </w:r>
     </w:p>
     <w:p>
@@ -5525,7 +5669,7 @@
           <w:color w:val="000000"/>
           <w:sz w:val="18"/>
         </w:rPr>
-        <w:t>Run physical mobile acceptance on the devices the sales team will use.</w:t>
+        <w:t>Complete production-device acceptance for navigation, quick note, follow-up and outcome flows; Call and WhatsApp are already device-verified.</w:t>
       </w:r>
     </w:p>
     <w:p>
@@ -5572,62 +5716,27 @@
         <w:t>README.md contains setup and integration instructions. docs/go-live-checklist.md is the operational acceptance list. Database migration 0006 is the authoritative canonical-outcome/follow-up-attribution migration. Automated tests are the acceptance evidence for application behavior.</w:t>
       </w:r>
     </w:p>
-    <w:tbl>
-      <w:tblPr>
-        <w:tblW w:type="auto" w:w="0"/>
-        <w:jc w:val="center"/>
-        <w:tblLayout w:type="fixed"/>
-        <w:tblLook w:firstColumn="1" w:firstRow="1" w:lastColumn="0" w:lastRow="0" w:noHBand="0" w:noVBand="1" w:val="04A0"/>
-      </w:tblPr>
-      <w:tblGrid>
-        <w:gridCol w:w="9720"/>
-      </w:tblGrid>
-      <w:tr>
-        <w:tc>
-          <w:tcPr>
-            <w:tcW w:type="dxa" w:w="9994"/>
-            <w:shd w:fill="EAF5EE"/>
-            <w:tcMar>
-              <w:top w:w="140" w:type="dxa"/>
-              <w:start w:w="160" w:type="dxa"/>
-              <w:bottom w:w="140" w:type="dxa"/>
-              <w:end w:w="160" w:type="dxa"/>
-            </w:tcMar>
-          </w:tcPr>
-          <w:p>
-            <w:pPr>
-              <w:spacing w:after="40"/>
-            </w:pPr>
-            <w:r>
-              <w:rPr>
-                <w:rFonts w:ascii="Arial" w:hAnsi="Arial"/>
-                <w:b/>
-                <w:color w:val="000000"/>
-                <w:sz w:val="21"/>
-              </w:rPr>
-              <w:t>HANDOFF DECISION</w:t>
-            </w:r>
-          </w:p>
-          <w:p>
-            <w:pPr>
-              <w:spacing w:after="0" w:line="259" w:lineRule="auto"/>
-            </w:pPr>
-            <w:r>
-              <w:rPr>
-                <w:rFonts w:ascii="Arial" w:hAnsi="Arial"/>
-                <w:color w:val="000000"/>
-                <w:sz w:val="18"/>
-              </w:rPr>
-              <w:t>The codebase is ready for the client's deployment team to run on the target VPS. Production traffic should not begin until the Docker boot, real Sheet test, physical mobile test, tenant-access check and backup/restore checklist have passed in that environment.</w:t>
-            </w:r>
-          </w:p>
-        </w:tc>
-      </w:tr>
-    </w:tbl>
     <w:p>
       <w:pPr>
-        <w:spacing w:after="0"/>
+        <w:spacing w:before="120" w:after="80"/>
       </w:pPr>
+      <w:r>
+        <w:rPr>
+          <w:rFonts w:ascii="Arial" w:hAnsi="Arial"/>
+          <w:b/>
+          <w:color w:val="000000"/>
+          <w:sz w:val="19"/>
+        </w:rPr>
+        <w:t xml:space="preserve">HANDOFF DECISION. </w:t>
+      </w:r>
+      <w:r>
+        <w:rPr>
+          <w:rFonts w:ascii="Arial" w:hAnsi="Arial"/>
+          <w:color w:val="000000"/>
+          <w:sz w:val="19"/>
+        </w:rPr>
+        <w:t>The codebase is ready for the client's deployment team to run beside the existing CRM using the documented override and reverse-proxy site block. Production traffic should not begin until the Docker boot, real Sheet test, remaining production-device flows, tenant-access check and backup/restore checklist have passed in that environment.</w:t>
+      </w:r>
     </w:p>
     <w:sectPr>
       <w:pgSz w:w="12240" w:h="15840"/>

</xml_diff>

<commit_message>
Clarify handoff sources and VPS wording
</commit_message>
<xml_diff>
--- a/docs/Lead-Response-Desk-Technical-Handoff.docx
+++ b/docs/Lead-Response-Desk-Technical-Handoff.docx
@@ -5609,7 +5609,7 @@
           <w:color w:val="000000"/>
           <w:sz w:val="18"/>
         </w:rPr>
-        <w:t>Approve the final domain, create DNS and provision the Mumbai VPS with Docker Engine and Compose.</w:t>
+        <w:t>Approve the final domain, create DNS and provision the client's VPS with Docker Engine and Compose.</w:t>
       </w:r>
     </w:p>
     <w:p>
@@ -5713,7 +5713,7 @@
           <w:color w:val="000000"/>
           <w:sz w:val="18"/>
         </w:rPr>
-        <w:t>README.md contains setup and integration instructions. docs/go-live-checklist.md is the operational acceptance list. Database migration 0006 is the authoritative canonical-outcome/follow-up-attribution migration. Automated tests are the acceptance evidence for application behavior.</w:t>
+        <w:t>AGENTS.md is the first operational source for Codex, Claude Code, Cursor and other AI coding agents; it records the product flow, invariants, removed features, key files, CRM extension points and the existing-VPS deployment guardrails. README.md contains setup and integration instructions. docs/go-live-checklist.md is the operational acceptance list. Database migration 0006 is the authoritative canonical-outcome/follow-up-attribution migration. Automated tests are the acceptance evidence for application behavior.</w:t>
       </w:r>
     </w:p>
     <w:p>

</xml_diff>